<commit_message>
updated terms and pp
</commit_message>
<xml_diff>
--- a/public/legal/FoodNinja_Privacy_Policy_EN.docx
+++ b/public/legal/FoodNinja_Privacy_Policy_EN.docx
@@ -61,7 +61,7 @@
       </w:r>
       <w:r>
         <w:rPr>
-          <w:rFonts w:ascii="MS Gothic" w:eastAsia="MS Gothic" w:hAnsi="MS Gothic" w:cs="MS Gothic" w:hint="eastAsia"/>
+          <w:rFonts w:ascii="MISANS TC VF MEDIUM" w:eastAsia="MISANS TC VF MEDIUM" w:hAnsi="MISANS TC VF MEDIUM" w:cs="MS Gothic" w:hint="eastAsia"/>
           <w:color w:val="555555"/>
           <w:sz w:val="20"/>
           <w:szCs w:val="20"/>
@@ -75,11 +75,11 @@
           <w:sz w:val="20"/>
           <w:szCs w:val="20"/>
         </w:rPr>
-        <w:t>2</w:t>
-      </w:r>
-      <w:r>
-        <w:rPr>
-          <w:rFonts w:ascii="MS Gothic" w:eastAsia="MS Gothic" w:hAnsi="MS Gothic" w:cs="MS Gothic" w:hint="eastAsia"/>
+        <w:t>4</w:t>
+      </w:r>
+      <w:r>
+        <w:rPr>
+          <w:rFonts w:ascii="MISANS TC VF MEDIUM" w:eastAsia="MISANS TC VF MEDIUM" w:hAnsi="MISANS TC VF MEDIUM" w:cs="MS Gothic" w:hint="eastAsia"/>
           <w:color w:val="555555"/>
           <w:sz w:val="20"/>
           <w:szCs w:val="20"/>
@@ -93,11 +93,11 @@
           <w:sz w:val="20"/>
           <w:szCs w:val="20"/>
         </w:rPr>
-        <w:t>20</w:t>
-      </w:r>
-      <w:r>
-        <w:rPr>
-          <w:rFonts w:ascii="MS Gothic" w:eastAsia="MS Gothic" w:hAnsi="MS Gothic" w:cs="MS Gothic" w:hint="eastAsia"/>
+        <w:t>5</w:t>
+      </w:r>
+      <w:r>
+        <w:rPr>
+          <w:rFonts w:ascii="MISANS TC VF MEDIUM" w:eastAsia="MISANS TC VF MEDIUM" w:hAnsi="MISANS TC VF MEDIUM" w:cs="MS Gothic" w:hint="eastAsia"/>
           <w:color w:val="555555"/>
           <w:sz w:val="20"/>
           <w:szCs w:val="20"/>
@@ -111,7 +111,43 @@
           <w:sz w:val="20"/>
           <w:szCs w:val="20"/>
         </w:rPr>
-        <w:t xml:space="preserve"> / February 20, 2026</w:t>
+        <w:t xml:space="preserve"> / </w:t>
+      </w:r>
+      <w:r>
+        <w:rPr>
+          <w:rFonts w:ascii="Roboto" w:hAnsi="Roboto"/>
+          <w:color w:val="555555"/>
+          <w:sz w:val="20"/>
+          <w:szCs w:val="20"/>
+        </w:rPr>
+        <w:t>April</w:t>
+      </w:r>
+      <w:r>
+        <w:rPr>
+          <w:rFonts w:ascii="Roboto" w:hAnsi="Roboto"/>
+          <w:color w:val="555555"/>
+          <w:sz w:val="20"/>
+          <w:szCs w:val="20"/>
+        </w:rPr>
+        <w:t xml:space="preserve"> </w:t>
+      </w:r>
+      <w:r>
+        <w:rPr>
+          <w:rFonts w:ascii="Roboto" w:hAnsi="Roboto"/>
+          <w:color w:val="555555"/>
+          <w:sz w:val="20"/>
+          <w:szCs w:val="20"/>
+        </w:rPr>
+        <w:t>5</w:t>
+      </w:r>
+      <w:r>
+        <w:rPr>
+          <w:rFonts w:ascii="Roboto" w:hAnsi="Roboto"/>
+          <w:color w:val="555555"/>
+          <w:sz w:val="20"/>
+          <w:szCs w:val="20"/>
+        </w:rPr>
+        <w:t>, 2026</w:t>
       </w:r>
     </w:p>
     <w:p>
@@ -450,6 +486,7 @@
         <w:rPr>
           <w:rFonts w:ascii="Roboto" w:hAnsi="Roboto"/>
         </w:rPr>
+        <w:lastRenderedPageBreak/>
         <w:t>App Store server notification type and payload (used to process subscription lifecycle events such as renewals, cancellations, and refunds)</w:t>
       </w:r>
     </w:p>
@@ -464,7 +501,6 @@
         <w:rPr>
           <w:rFonts w:ascii="Roboto" w:hAnsi="Roboto"/>
         </w:rPr>
-        <w:lastRenderedPageBreak/>
         <w:t>We do not collect, process, or store any payment card numbers, bank account details, or any other financial information. All payment processing is performed solely by Apple. The data above is limited to Apple-issued transaction identifiers and metadata necessary to verify and maintain your subscription status.</w:t>
       </w:r>
     </w:p>
@@ -1278,6 +1314,25 @@
           <w:rFonts w:ascii="Roboto" w:hAnsi="Roboto"/>
         </w:rPr>
         <w:t>Google (Sign in with Google, Google Calendar, Google Tasks — the latter two only if you enable sync): governed by Google's Privacy Policy</w:t>
+      </w:r>
+    </w:p>
+    <w:p>
+      <w:pPr>
+        <w:pStyle w:val="ListParagraph"/>
+        <w:numPr>
+          <w:ilvl w:val="0"/>
+          <w:numId w:val="2"/>
+        </w:numPr>
+        <w:spacing w:after="80"/>
+        <w:rPr>
+          <w:rFonts w:ascii="Roboto" w:hAnsi="Roboto"/>
+        </w:rPr>
+      </w:pPr>
+      <w:r>
+        <w:rPr>
+          <w:rFonts w:ascii="Roboto" w:hAnsi="Roboto"/>
+        </w:rPr>
+        <w:t>Google (AI features in the Service are all powered by Google Gemini): governed by Google’s Privacy Policy</w:t>
       </w:r>
     </w:p>
     <w:p>
@@ -1945,9 +2000,13 @@
   <w:p>
     <w:pPr>
       <w:jc w:val="center"/>
+      <w:rPr>
+        <w:rFonts w:ascii="Roboto" w:hAnsi="Roboto"/>
+      </w:rPr>
     </w:pPr>
     <w:r>
       <w:rPr>
+        <w:rFonts w:ascii="Roboto" w:hAnsi="Roboto"/>
         <w:color w:val="888888"/>
         <w:sz w:val="18"/>
         <w:szCs w:val="18"/>
@@ -1956,6 +2015,7 @@
     </w:r>
     <w:r>
       <w:rPr>
+        <w:rFonts w:ascii="Roboto" w:hAnsi="Roboto"/>
         <w:color w:val="888888"/>
         <w:sz w:val="18"/>
         <w:szCs w:val="18"/>
@@ -1964,6 +2024,7 @@
     </w:r>
     <w:r>
       <w:rPr>
+        <w:rFonts w:ascii="Roboto" w:hAnsi="Roboto"/>
         <w:color w:val="888888"/>
         <w:sz w:val="18"/>
         <w:szCs w:val="18"/>
@@ -1972,6 +2033,7 @@
     </w:r>
     <w:r>
       <w:rPr>
+        <w:rFonts w:ascii="Roboto" w:hAnsi="Roboto"/>
         <w:color w:val="888888"/>
         <w:sz w:val="18"/>
         <w:szCs w:val="18"/>
@@ -1980,6 +2042,7 @@
     </w:r>
     <w:r>
       <w:rPr>
+        <w:rFonts w:ascii="Roboto" w:hAnsi="Roboto"/>
         <w:noProof/>
         <w:color w:val="888888"/>
         <w:sz w:val="18"/>
@@ -1989,6 +2052,7 @@
     </w:r>
     <w:r>
       <w:rPr>
+        <w:rFonts w:ascii="Roboto" w:hAnsi="Roboto"/>
         <w:color w:val="888888"/>
         <w:sz w:val="18"/>
         <w:szCs w:val="18"/>
@@ -1997,6 +2061,7 @@
     </w:r>
     <w:r>
       <w:rPr>
+        <w:rFonts w:ascii="Roboto" w:hAnsi="Roboto"/>
         <w:color w:val="888888"/>
         <w:sz w:val="18"/>
         <w:szCs w:val="18"/>
@@ -2005,6 +2070,7 @@
     </w:r>
     <w:r>
       <w:rPr>
+        <w:rFonts w:ascii="Roboto" w:hAnsi="Roboto"/>
         <w:color w:val="888888"/>
         <w:sz w:val="18"/>
         <w:szCs w:val="18"/>
@@ -2013,6 +2079,7 @@
     </w:r>
     <w:r>
       <w:rPr>
+        <w:rFonts w:ascii="Roboto" w:hAnsi="Roboto"/>
         <w:color w:val="888888"/>
         <w:sz w:val="18"/>
         <w:szCs w:val="18"/>
@@ -2021,6 +2088,7 @@
     </w:r>
     <w:r>
       <w:rPr>
+        <w:rFonts w:ascii="Roboto" w:hAnsi="Roboto"/>
         <w:color w:val="888888"/>
         <w:sz w:val="18"/>
         <w:szCs w:val="18"/>
@@ -2029,6 +2097,7 @@
     </w:r>
     <w:r>
       <w:rPr>
+        <w:rFonts w:ascii="Roboto" w:hAnsi="Roboto"/>
         <w:noProof/>
         <w:color w:val="888888"/>
         <w:sz w:val="18"/>
@@ -2038,6 +2107,7 @@
     </w:r>
     <w:r>
       <w:rPr>
+        <w:rFonts w:ascii="Roboto" w:hAnsi="Roboto"/>
         <w:color w:val="888888"/>
         <w:sz w:val="18"/>
         <w:szCs w:val="18"/>
@@ -2074,9 +2144,13 @@
       <w:pBdr>
         <w:bottom w:val="single" w:sz="4" w:space="1" w:color="4CAF50"/>
       </w:pBdr>
+      <w:rPr>
+        <w:rFonts w:ascii="Roboto" w:hAnsi="Roboto"/>
+      </w:rPr>
     </w:pPr>
     <w:r>
       <w:rPr>
+        <w:rFonts w:ascii="Roboto" w:hAnsi="Roboto"/>
         <w:b/>
         <w:bCs/>
         <w:color w:val="2E7D32"/>
@@ -2821,6 +2895,48 @@
       <w:szCs w:val="20"/>
     </w:rPr>
   </w:style>
+  <w:style w:type="paragraph" w:styleId="Header">
+    <w:name w:val="header"/>
+    <w:basedOn w:val="Normal"/>
+    <w:link w:val="HeaderChar"/>
+    <w:uiPriority w:val="99"/>
+    <w:unhideWhenUsed/>
+    <w:rsid w:val="00817DCE"/>
+    <w:pPr>
+      <w:tabs>
+        <w:tab w:val="center" w:pos="4680"/>
+        <w:tab w:val="right" w:pos="9360"/>
+      </w:tabs>
+    </w:pPr>
+  </w:style>
+  <w:style w:type="character" w:customStyle="1" w:styleId="HeaderChar">
+    <w:name w:val="Header Char"/>
+    <w:basedOn w:val="DefaultParagraphFont"/>
+    <w:link w:val="Header"/>
+    <w:uiPriority w:val="99"/>
+    <w:rsid w:val="00817DCE"/>
+  </w:style>
+  <w:style w:type="paragraph" w:styleId="Footer">
+    <w:name w:val="footer"/>
+    <w:basedOn w:val="Normal"/>
+    <w:link w:val="FooterChar"/>
+    <w:uiPriority w:val="99"/>
+    <w:unhideWhenUsed/>
+    <w:rsid w:val="00817DCE"/>
+    <w:pPr>
+      <w:tabs>
+        <w:tab w:val="center" w:pos="4680"/>
+        <w:tab w:val="right" w:pos="9360"/>
+      </w:tabs>
+    </w:pPr>
+  </w:style>
+  <w:style w:type="character" w:customStyle="1" w:styleId="FooterChar">
+    <w:name w:val="Footer Char"/>
+    <w:basedOn w:val="DefaultParagraphFont"/>
+    <w:link w:val="Footer"/>
+    <w:uiPriority w:val="99"/>
+    <w:rsid w:val="00817DCE"/>
+  </w:style>
 </w:styles>
 </file>
 

</xml_diff>

<commit_message>
Updated PP and TOS
</commit_message>
<xml_diff>
--- a/public/legal/FoodNinja_Privacy_Policy_EN.docx
+++ b/public/legal/FoodNinja_Privacy_Policy_EN.docx
@@ -93,7 +93,7 @@
           <w:sz w:val="20"/>
           <w:szCs w:val="20"/>
         </w:rPr>
-        <w:t>11</w:t>
+        <w:t>25</w:t>
       </w:r>
       <w:r>
         <w:rPr>
@@ -138,7 +138,7 @@
           <w:sz w:val="20"/>
           <w:szCs w:val="20"/>
         </w:rPr>
-        <w:t>11</w:t>
+        <w:t>25</w:t>
       </w:r>
       <w:r>
         <w:rPr>
@@ -947,7 +947,7 @@
       <w:pPr>
         <w:spacing w:after="120"/>
         <w:rPr>
-          <w:rFonts w:ascii="Roboto" w:hAnsi="Roboto"/>
+          <w:rStyle w:val="citation-34"/>
         </w:rPr>
       </w:pPr>
       <w:r>
@@ -960,19 +960,7 @@
         <w:rPr>
           <w:rStyle w:val="citation-37"/>
         </w:rPr>
-        <w:t xml:space="preserve">If you choose to perform a backup, the app's data (including </w:t>
-      </w:r>
-      <w:r>
-        <w:rPr>
-          <w:rStyle w:val="citation-37"/>
-        </w:rPr>
-        <w:t>inventory records, chat, and other necessary data</w:t>
-      </w:r>
-      <w:r>
-        <w:rPr>
-          <w:rStyle w:val="citation-37"/>
-        </w:rPr>
-        <w:t xml:space="preserve">) is uploaded to your personal iCloud Private Database. </w:t>
+        <w:t xml:space="preserve">If you choose to perform a backup, the app's data (including inventory records, chat, and other necessary data) is uploaded to your personal iCloud Private Database. </w:t>
       </w:r>
       <w:r>
         <w:rPr>
@@ -991,6 +979,124 @@
           <w:rStyle w:val="citation-34"/>
         </w:rPr>
         <w:t>You may delete these backups at any time through your iOS device settings.</w:t>
+      </w:r>
+    </w:p>
+    <w:p>
+      <w:pPr>
+        <w:pStyle w:val="Heading2"/>
+        <w:spacing w:before="280" w:after="100"/>
+        <w:rPr>
+          <w:rFonts w:ascii="Roboto" w:hAnsi="Roboto"/>
+        </w:rPr>
+      </w:pPr>
+      <w:r>
+        <w:rPr>
+          <w:rFonts w:ascii="Roboto" w:hAnsi="Roboto"/>
+        </w:rPr>
+        <w:t>2.</w:t>
+      </w:r>
+      <w:r>
+        <w:rPr>
+          <w:rFonts w:ascii="Roboto" w:hAnsi="Roboto"/>
+        </w:rPr>
+        <w:t>9</w:t>
+      </w:r>
+      <w:r>
+        <w:rPr>
+          <w:rFonts w:ascii="Roboto" w:hAnsi="Roboto"/>
+        </w:rPr>
+        <w:t xml:space="preserve"> </w:t>
+      </w:r>
+      <w:r>
+        <w:rPr>
+          <w:rFonts w:ascii="Roboto" w:hAnsi="Roboto"/>
+        </w:rPr>
+        <w:t>Trees Planting in the Service</w:t>
+      </w:r>
+    </w:p>
+    <w:p>
+      <w:pPr>
+        <w:spacing w:after="120"/>
+        <w:rPr>
+          <w:rStyle w:val="citation-34"/>
+        </w:rPr>
+      </w:pPr>
+      <w:r>
+        <w:rPr>
+          <w:rStyle w:val="citation-34"/>
+        </w:rPr>
+        <w:t xml:space="preserve">When you reach 100% in the Service’s Trees tab/page, the Service plants a tree in real life to help the environment. We do not collect any associated data configured in the Service by you. </w:t>
+      </w:r>
+      <w:r>
+        <w:rPr>
+          <w:rStyle w:val="citation-34"/>
+        </w:rPr>
+        <w:t xml:space="preserve">We plant trees with the third-party “TheGoodAPI”, and we do not share your data to this third-party. </w:t>
+      </w:r>
+    </w:p>
+    <w:p>
+      <w:pPr>
+        <w:pStyle w:val="Heading2"/>
+        <w:spacing w:before="280" w:after="100"/>
+        <w:rPr>
+          <w:rFonts w:ascii="Roboto" w:hAnsi="Roboto"/>
+        </w:rPr>
+      </w:pPr>
+      <w:r>
+        <w:rPr>
+          <w:rFonts w:ascii="Roboto" w:hAnsi="Roboto"/>
+        </w:rPr>
+        <w:t>2.</w:t>
+      </w:r>
+      <w:r>
+        <w:rPr>
+          <w:rFonts w:ascii="Roboto" w:hAnsi="Roboto"/>
+        </w:rPr>
+        <w:t>10</w:t>
+      </w:r>
+      <w:r>
+        <w:rPr>
+          <w:rFonts w:ascii="Roboto" w:hAnsi="Roboto"/>
+        </w:rPr>
+        <w:t xml:space="preserve"> </w:t>
+      </w:r>
+      <w:r>
+        <w:rPr>
+          <w:rFonts w:ascii="Roboto" w:hAnsi="Roboto"/>
+        </w:rPr>
+        <w:t>Aggregated An</w:t>
+      </w:r>
+      <w:r>
+        <w:rPr>
+          <w:rFonts w:ascii="Roboto" w:hAnsi="Roboto"/>
+        </w:rPr>
+        <w:t>onymous</w:t>
+      </w:r>
+      <w:r>
+        <w:rPr>
+          <w:rFonts w:ascii="Roboto" w:hAnsi="Roboto"/>
+        </w:rPr>
+        <w:t xml:space="preserve"> Data</w:t>
+      </w:r>
+    </w:p>
+    <w:p>
+      <w:pPr>
+        <w:spacing w:after="120"/>
+        <w:rPr>
+          <w:rFonts w:ascii="Roboto" w:hAnsi="Roboto"/>
+        </w:rPr>
+      </w:pPr>
+      <w:r>
+        <w:rPr>
+          <w:rFonts w:ascii="Roboto" w:hAnsi="Roboto"/>
+        </w:rPr>
+        <w:t xml:space="preserve">We aggregate the records created and total trees planted in </w:t>
+      </w:r>
+      <w:r>
+        <w:rPr>
+          <w:rFonts w:ascii="Roboto" w:hAnsi="Roboto"/>
+        </w:rPr>
+        <w:t>the Service. These data are solely used for the purpose of analytics and shareable metrics, and they can not be linked backed to the original user in any way. We only store the date and aggregated amount.</w:t>
       </w:r>
     </w:p>
     <w:p>
@@ -1133,6 +1239,7 @@
         <w:rPr>
           <w:rFonts w:ascii="Roboto" w:hAnsi="Roboto"/>
         </w:rPr>
+        <w:lastRenderedPageBreak/>
         <w:t>To communicate with you about your account or material changes to the Service</w:t>
       </w:r>
     </w:p>
@@ -1257,7 +1364,6 @@
         <w:rPr>
           <w:rFonts w:ascii="Roboto" w:hAnsi="Roboto"/>
         </w:rPr>
-        <w:lastRenderedPageBreak/>
         <w:t>Consent: where required by applicable law, including for users under the age of digital consent</w:t>
       </w:r>
     </w:p>
@@ -1491,6 +1597,7 @@
         <w:rPr>
           <w:rFonts w:ascii="Roboto" w:hAnsi="Roboto"/>
         </w:rPr>
+        <w:lastRenderedPageBreak/>
         <w:t>Upon account deletion:</w:t>
       </w:r>
     </w:p>
@@ -1577,7 +1684,6 @@
         <w:rPr>
           <w:rFonts w:ascii="Roboto" w:hAnsi="Roboto"/>
         </w:rPr>
-        <w:lastRenderedPageBreak/>
         <w:t>8. Data Security</w:t>
       </w:r>
     </w:p>
@@ -1896,6 +2002,7 @@
         <w:rPr>
           <w:rFonts w:ascii="Roboto" w:hAnsi="Roboto"/>
         </w:rPr>
+        <w:lastRenderedPageBreak/>
         <w:t>Hetzner Online GmbH acts as a data processor on our behalf. Hetzner provides a Data Processing Agreement (DPA) as part of their standard terms of service, ensuring your data is handled in accordance with GDPR requirements.</w:t>
       </w:r>
     </w:p>
@@ -1939,7 +2046,6 @@
         <w:rPr>
           <w:rFonts w:ascii="Roboto" w:hAnsi="Roboto"/>
         </w:rPr>
-        <w:lastRenderedPageBreak/>
         <w:t>We may update this Privacy Policy from time to time. When we do, we will update the Effective Date and, where appropriate, notify you through the app or by email.</w:t>
       </w:r>
     </w:p>

</xml_diff>